<commit_message>
add bulk onboarding script
</commit_message>
<xml_diff>
--- a/scripts/bulk-agent-registration/A365-Orchestrator-Setup-Guide.docx
+++ b/scripts/bulk-agent-registration/A365-Orchestrator-Setup-Guide.docx
@@ -9330,6 +9330,30 @@
           </w:p>
         </w:tc>
       </w:tr>
+      <w:tr>
+        <w:tc>
+          <w:tcPr>
+            <w:tcW w:type="dxa" w:w="3216"/>
+          </w:tcPr>
+          <w:p>
+            <w:pPr/>
+            <w:r>
+              <w:t>A365-BulkOnboarding.ps1</w:t>
+            </w:r>
+          </w:p>
+        </w:tc>
+        <w:tc>
+          <w:tcPr>
+            <w:tcW w:type="dxa" w:w="3216"/>
+          </w:tcPr>
+          <w:p>
+            <w:pPr/>
+            <w:r>
+              <w:t>Provisions many agents from one CSV file; drives the orchestrator once per row, in dependency order</w:t>
+            </w:r>
+          </w:p>
+        </w:tc>
+      </w:tr>
     </w:tbl>
     <w:p/>
     <w:p/>
@@ -9936,6 +9960,571 @@
       </w:tr>
     </w:tbl>
     <w:p/>
+    <w:p>
+      <w:pPr>
+        <w:pStyle w:val="Heading1"/>
+      </w:pPr>
+      <w:r>
+        <w:t>13. Bulk CSV onboarding (A365-BulkOnboarding.ps1)</w:t>
+      </w:r>
+    </w:p>
+    <w:p>
+      <w:pPr>
+        <w:pStyle w:val="Heading2"/>
+      </w:pPr>
+      <w:r>
+        <w:t>13.1 What it does</w:t>
+      </w:r>
+    </w:p>
+    <w:p>
+      <w:pPr/>
+      <w:r>
+        <w:t>A365-AutomationOrchestrator.ps1 provisions one agent per invocation. A365-BulkOnboarding.ps1 reads a CSV describing many blueprints, agent identities, agent users and registrations, works out which rows depend on which, and calls the orchestrator once per row that needs creating - always in an order where a parent runs before its children - threading the id each parent produces into the children that need it.</w:t>
+      </w:r>
+    </w:p>
+    <w:p>
+      <w:pPr/>
+      <w:r>
+        <w:t>The orchestrator is invoked in-process with the PowerShell call operator, in the same runspace as the wrapper script. No new process is started and nothing is serialized: a SecureString client secret or an X509Certificate2 passed to -ClientSecret / -Certificate stays the exact same live object for every row that uses it.</w:t>
+      </w:r>
+    </w:p>
+    <w:p>
+      <w:pPr>
+        <w:pStyle w:val="Heading2"/>
+      </w:pPr>
+      <w:r>
+        <w:t>13.2 CSV schema</w:t>
+      </w:r>
+    </w:p>
+    <w:p>
+      <w:pPr/>
+      <w:r>
+        <w:t>One row per object. Every row always has these four columns, blank when not applicable:</w:t>
+      </w:r>
+    </w:p>
+    <w:tbl>
+      <w:tblPr>
+        <w:tblStyle w:val="LightGrid-Accent1"/>
+        <w:tblW w:type="auto" w:w="0"/>
+        <w:tblLook w:firstColumn="1" w:firstRow="1" w:lastColumn="0" w:lastRow="0" w:noHBand="0" w:noVBand="1" w:val="04A0"/>
+      </w:tblPr>
+      <w:tblGrid>
+        <w:gridCol w:w="4824"/>
+        <w:gridCol w:w="4824"/>
+      </w:tblGrid>
+      <w:tr>
+        <w:tc>
+          <w:tcPr>
+            <w:tcW w:type="dxa" w:w="4824"/>
+          </w:tcPr>
+          <w:p>
+            <w:r>
+              <w:t>Column</w:t>
+            </w:r>
+          </w:p>
+        </w:tc>
+        <w:tc>
+          <w:tcPr>
+            <w:tcW w:type="dxa" w:w="4824"/>
+          </w:tcPr>
+          <w:p>
+            <w:r>
+              <w:t>Meaning</w:t>
+            </w:r>
+          </w:p>
+        </w:tc>
+      </w:tr>
+      <w:tr>
+        <w:tc>
+          <w:tcPr>
+            <w:tcW w:type="dxa" w:w="4824"/>
+          </w:tcPr>
+          <w:p>
+            <w:r>
+              <w:t>ObjectType</w:t>
+            </w:r>
+          </w:p>
+        </w:tc>
+        <w:tc>
+          <w:tcPr>
+            <w:tcW w:type="dxa" w:w="4824"/>
+          </w:tcPr>
+          <w:p>
+            <w:r>
+              <w:t>Blueprint | AgentIdentity | AgentUser | AgentRegistration</w:t>
+            </w:r>
+          </w:p>
+        </w:tc>
+      </w:tr>
+      <w:tr>
+        <w:tc>
+          <w:tcPr>
+            <w:tcW w:type="dxa" w:w="4824"/>
+          </w:tcPr>
+          <w:p>
+            <w:r>
+              <w:t>Key</w:t>
+            </w:r>
+          </w:p>
+        </w:tc>
+        <w:tc>
+          <w:tcPr>
+            <w:tcW w:type="dxa" w:w="4824"/>
+          </w:tcPr>
+          <w:p>
+            <w:r>
+              <w:t>Unique name for this row (case-insensitive); referenced by child rows</w:t>
+            </w:r>
+          </w:p>
+        </w:tc>
+      </w:tr>
+      <w:tr>
+        <w:tc>
+          <w:tcPr>
+            <w:tcW w:type="dxa" w:w="4824"/>
+          </w:tcPr>
+          <w:p>
+            <w:r>
+              <w:t>ParentKey</w:t>
+            </w:r>
+          </w:p>
+        </w:tc>
+        <w:tc>
+          <w:tcPr>
+            <w:tcW w:type="dxa" w:w="4824"/>
+          </w:tcPr>
+          <w:p>
+            <w:r>
+              <w:t>The Key of this row's parent. Blank for Blueprint (the root)</w:t>
+            </w:r>
+          </w:p>
+        </w:tc>
+      </w:tr>
+      <w:tr>
+        <w:tc>
+          <w:tcPr>
+            <w:tcW w:type="dxa" w:w="4824"/>
+          </w:tcPr>
+          <w:p>
+            <w:r>
+              <w:t>ExistingId</w:t>
+            </w:r>
+          </w:p>
+        </w:tc>
+        <w:tc>
+          <w:tcPr>
+            <w:tcW w:type="dxa" w:w="4824"/>
+          </w:tcPr>
+          <w:p>
+            <w:r>
+              <w:t>Blueprint appId or AgentIdentity objectId of an object that already exists. Marks the row as a reference only - nothing is created or changed for it</w:t>
+            </w:r>
+          </w:p>
+        </w:tc>
+      </w:tr>
+    </w:tbl>
+    <w:p>
+      <w:pPr/>
+      <w:r>
+        <w:t>Every other column maps to one -Blueprint* / -AgentIdentity* / -AgentUser* / -AgentRegistration* parameter of the orchestrator. A column that does not apply to a row's ObjectType must be left blank; it is rejected outright, not silently ignored.</w:t>
+      </w:r>
+    </w:p>
+    <w:tbl>
+      <w:tblPr>
+        <w:tblStyle w:val="LightGrid-Accent1"/>
+        <w:tblW w:type="auto" w:w="0"/>
+        <w:tblLook w:firstColumn="1" w:firstRow="1" w:lastColumn="0" w:lastRow="0" w:noHBand="0" w:noVBand="1" w:val="04A0"/>
+      </w:tblPr>
+      <w:tblGrid>
+        <w:gridCol w:w="3216"/>
+        <w:gridCol w:w="3216"/>
+        <w:gridCol w:w="3216"/>
+      </w:tblGrid>
+      <w:tr>
+        <w:tc>
+          <w:tcPr>
+            <w:tcW w:type="dxa" w:w="3216"/>
+          </w:tcPr>
+          <w:p>
+            <w:r>
+              <w:t>Column</w:t>
+            </w:r>
+          </w:p>
+        </w:tc>
+        <w:tc>
+          <w:tcPr>
+            <w:tcW w:type="dxa" w:w="3216"/>
+          </w:tcPr>
+          <w:p>
+            <w:r>
+              <w:t>Applies to</w:t>
+            </w:r>
+          </w:p>
+        </w:tc>
+        <w:tc>
+          <w:tcPr>
+            <w:tcW w:type="dxa" w:w="3216"/>
+          </w:tcPr>
+          <w:p>
+            <w:r>
+              <w:t>Notes</w:t>
+            </w:r>
+          </w:p>
+        </w:tc>
+      </w:tr>
+      <w:tr>
+        <w:tc>
+          <w:tcPr>
+            <w:tcW w:type="dxa" w:w="3216"/>
+          </w:tcPr>
+          <w:p>
+            <w:r>
+              <w:t>DisplayName</w:t>
+            </w:r>
+          </w:p>
+        </w:tc>
+        <w:tc>
+          <w:tcPr>
+            <w:tcW w:type="dxa" w:w="3216"/>
+          </w:tcPr>
+          <w:p>
+            <w:r>
+              <w:t>Blueprint, AgentIdentity, AgentUser, AgentRegistration</w:t>
+            </w:r>
+          </w:p>
+        </w:tc>
+        <w:tc>
+          <w:tcPr>
+            <w:tcW w:type="dxa" w:w="3216"/>
+          </w:tcPr>
+          <w:p>
+            <w:r>
+              <w:t>Required to create a Blueprint, AgentIdentity, or AgentRegistration</w:t>
+            </w:r>
+          </w:p>
+        </w:tc>
+      </w:tr>
+      <w:tr>
+        <w:tc>
+          <w:tcPr>
+            <w:tcW w:type="dxa" w:w="3216"/>
+          </w:tcPr>
+          <w:p>
+            <w:r>
+              <w:t>Sponsor (semicolon-separated)</w:t>
+            </w:r>
+          </w:p>
+        </w:tc>
+        <w:tc>
+          <w:tcPr>
+            <w:tcW w:type="dxa" w:w="3216"/>
+          </w:tcPr>
+          <w:p>
+            <w:r>
+              <w:t>Blueprint, AgentIdentity</w:t>
+            </w:r>
+          </w:p>
+        </w:tc>
+        <w:tc>
+          <w:tcPr>
+            <w:tcW w:type="dxa" w:w="3216"/>
+          </w:tcPr>
+          <w:p>
+            <w:r>
+              <w:t>Required to create</w:t>
+            </w:r>
+          </w:p>
+        </w:tc>
+      </w:tr>
+      <w:tr>
+        <w:tc>
+          <w:tcPr>
+            <w:tcW w:type="dxa" w:w="3216"/>
+          </w:tcPr>
+          <w:p>
+            <w:r>
+              <w:t>Owner (semicolon-separated)</w:t>
+            </w:r>
+          </w:p>
+        </w:tc>
+        <w:tc>
+          <w:tcPr>
+            <w:tcW w:type="dxa" w:w="3216"/>
+          </w:tcPr>
+          <w:p>
+            <w:r>
+              <w:t>Blueprint, AgentIdentity, AgentRegistration</w:t>
+            </w:r>
+          </w:p>
+        </w:tc>
+        <w:tc>
+          <w:tcPr>
+            <w:tcW w:type="dxa" w:w="3216"/>
+          </w:tcPr>
+          <w:p>
+            <w:r/>
+          </w:p>
+        </w:tc>
+      </w:tr>
+      <w:tr>
+        <w:tc>
+          <w:tcPr>
+            <w:tcW w:type="dxa" w:w="3216"/>
+          </w:tcPr>
+          <w:p>
+            <w:r>
+              <w:t>RequiredPermissionJson (JSON array)</w:t>
+            </w:r>
+          </w:p>
+        </w:tc>
+        <w:tc>
+          <w:tcPr>
+            <w:tcW w:type="dxa" w:w="3216"/>
+          </w:tcPr>
+          <w:p>
+            <w:r>
+              <w:t>Blueprint, AgentIdentity</w:t>
+            </w:r>
+          </w:p>
+        </w:tc>
+        <w:tc>
+          <w:tcPr>
+            <w:tcW w:type="dxa" w:w="3216"/>
+          </w:tcPr>
+          <w:p>
+            <w:r>
+              <w:t>Escape hatch for declared API permissions</w:t>
+            </w:r>
+          </w:p>
+        </w:tc>
+      </w:tr>
+      <w:tr>
+        <w:tc>
+          <w:tcPr>
+            <w:tcW w:type="dxa" w:w="3216"/>
+          </w:tcPr>
+          <w:p>
+            <w:r>
+              <w:t>PrincipalName</w:t>
+            </w:r>
+          </w:p>
+        </w:tc>
+        <w:tc>
+          <w:tcPr>
+            <w:tcW w:type="dxa" w:w="3216"/>
+          </w:tcPr>
+          <w:p>
+            <w:r>
+              <w:t>AgentUser</w:t>
+            </w:r>
+          </w:p>
+        </w:tc>
+        <w:tc>
+          <w:tcPr>
+            <w:tcW w:type="dxa" w:w="3216"/>
+          </w:tcPr>
+          <w:p>
+            <w:r>
+              <w:t>Required; must be a valid UPN</w:t>
+            </w:r>
+          </w:p>
+        </w:tc>
+      </w:tr>
+      <w:tr>
+        <w:tc>
+          <w:tcPr>
+            <w:tcW w:type="dxa" w:w="3216"/>
+          </w:tcPr>
+          <w:p>
+            <w:r>
+              <w:t>ManagerUserId (GUID) / ManagerUpn</w:t>
+            </w:r>
+          </w:p>
+        </w:tc>
+        <w:tc>
+          <w:tcPr>
+            <w:tcW w:type="dxa" w:w="3216"/>
+          </w:tcPr>
+          <w:p>
+            <w:r>
+              <w:t>AgentUser</w:t>
+            </w:r>
+          </w:p>
+        </w:tc>
+        <w:tc>
+          <w:tcPr>
+            <w:tcW w:type="dxa" w:w="3216"/>
+          </w:tcPr>
+          <w:p>
+            <w:r>
+              <w:t>Specify one, not both</w:t>
+            </w:r>
+          </w:p>
+        </w:tc>
+      </w:tr>
+      <w:tr>
+        <w:tc>
+          <w:tcPr>
+            <w:tcW w:type="dxa" w:w="3216"/>
+          </w:tcPr>
+          <w:p>
+            <w:r>
+              <w:t>AssignLicense / LicenseSkuId / LicenseSkuPartNumber / UsageLocation</w:t>
+            </w:r>
+          </w:p>
+        </w:tc>
+        <w:tc>
+          <w:tcPr>
+            <w:tcW w:type="dxa" w:w="3216"/>
+          </w:tcPr>
+          <w:p>
+            <w:r>
+              <w:t>AgentUser</w:t>
+            </w:r>
+          </w:p>
+        </w:tc>
+        <w:tc>
+          <w:tcPr>
+            <w:tcW w:type="dxa" w:w="3216"/>
+          </w:tcPr>
+          <w:p>
+            <w:r>
+              <w:t>UsageLocation and a SKU (LicenseSkuId or LicenseSkuPartNumber) are both required when AssignLicense is true</w:t>
+            </w:r>
+          </w:p>
+        </w:tc>
+      </w:tr>
+      <w:tr>
+        <w:tc>
+          <w:tcPr>
+            <w:tcW w:type="dxa" w:w="3216"/>
+          </w:tcPr>
+          <w:p>
+            <w:r>
+              <w:t>Auth (Same | Interactive)</w:t>
+            </w:r>
+          </w:p>
+        </w:tc>
+        <w:tc>
+          <w:tcPr>
+            <w:tcW w:type="dxa" w:w="3216"/>
+          </w:tcPr>
+          <w:p>
+            <w:r>
+              <w:t>AgentRegistration</w:t>
+            </w:r>
+          </w:p>
+        </w:tc>
+        <w:tc>
+          <w:tcPr>
+            <w:tcW w:type="dxa" w:w="3216"/>
+          </w:tcPr>
+          <w:p>
+            <w:r>
+              <w:t>Matches -AgentRegistrationAuth</w:t>
+            </w:r>
+          </w:p>
+        </w:tc>
+      </w:tr>
+      <w:tr>
+        <w:tc>
+          <w:tcPr>
+            <w:tcW w:type="dxa" w:w="3216"/>
+          </w:tcPr>
+          <w:p>
+            <w:r>
+              <w:t>ParameterJson (JSON object)</w:t>
+            </w:r>
+          </w:p>
+        </w:tc>
+        <w:tc>
+          <w:tcPr>
+            <w:tcW w:type="dxa" w:w="3216"/>
+          </w:tcPr>
+          <w:p>
+            <w:r>
+              <w:t>all types</w:t>
+            </w:r>
+          </w:p>
+        </w:tc>
+        <w:tc>
+          <w:tcPr>
+            <w:tcW w:type="dxa" w:w="3216"/>
+          </w:tcPr>
+          <w:p>
+            <w:r>
+              <w:t>Allowlisted advanced parameters only: Blueprint ClientSecretLifetimeDays, ExposedScopeValue, FederatedCredentialName; AgentIdentity Disabled; AgentUser DisabledPlans, MaxRetries, RetryDelaySeconds, NoDefaultOwner, NoOwnershipSelfHeal; AgentRegistration ManagedByAppId, RolePropagationDelaySeconds, SkipDisplayNameNormalization. Names must be complete; tenant, credential, authentication, parent, action, output and logging parameters are rejected.</w:t>
+            </w:r>
+          </w:p>
+        </w:tc>
+      </w:tr>
+    </w:tbl>
+    <w:p>
+      <w:pPr>
+        <w:pStyle w:val="Heading2"/>
+      </w:pPr>
+      <w:r>
+        <w:t>13.3 Validation and dependency ordering</w:t>
+      </w:r>
+    </w:p>
+    <w:p>
+      <w:pPr/>
+      <w:r>
+        <w:t>The whole file is checked before a single row is executed: required headers, a recognised ObjectType, unique keys, legal ExistingId / ParentKey shapes, valid GUIDs and UPNs, the fields required to create each type, a parent of the right type, no row parented to an AgentUser or AgentRegistration row (they are leaves), and no dependency cycle. Every error found is reported together, with its row and column.</w:t>
+      </w:r>
+    </w:p>
+    <w:p>
+      <w:pPr/>
+      <w:r>
+        <w:t>Rows then run in an order where every parent completes before its children, preserving the CSV's own order among rows that do not depend on each other. A row whose parent did not resolve to a live id is never sent to Graph - it is marked SkippedDependency, and independent trees elsewhere in the file still run. A row that itself fails is marked Failed and its descendants are then skipped the same way.</w:t>
+      </w:r>
+    </w:p>
+    <w:p>
+      <w:pPr>
+        <w:pStyle w:val="Heading2"/>
+      </w:pPr>
+      <w:r>
+        <w:t>13.4 Usage examples</w:t>
+      </w:r>
+    </w:p>
+    <w:p>
+      <w:pPr/>
+      <w:r>
+        <w:t>.\A365-BulkOnboarding.ps1 -CsvPath .\sample-bulk-onboarding.csv -TenantId &lt;tid&gt; -ClientId &lt;appId&gt; -ClientSecret $env:A365_CLIENT_SECRET -WhatIf</w:t>
+      </w:r>
+    </w:p>
+    <w:p>
+      <w:pPr/>
+      <w:r>
+        <w:t>Validates the CSV and prints the full dependency plan without calling Graph.</w:t>
+      </w:r>
+    </w:p>
+    <w:p>
+      <w:pPr/>
+      <w:r>
+        <w:t>.\A365-BulkOnboarding.ps1 -CsvPath .\sample-bulk-onboarding.csv -TenantId &lt;tid&gt; -ClientId &lt;appId&gt; -ClientSecret $env:A365_CLIENT_SECRET -LogPath 'C:\A365\Logs' -OutputJsonPath 'C:\A365\bulk-run.json'</w:t>
+      </w:r>
+    </w:p>
+    <w:p>
+      <w:pPr/>
+      <w:r>
+        <w:t>Provisions every row, sharing one log correlation id across every child script, and writes one aggregate report.</w:t>
+      </w:r>
+    </w:p>
+    <w:p>
+      <w:pPr>
+        <w:pStyle w:val="Heading2"/>
+      </w:pPr>
+      <w:r>
+        <w:t>13.5 Aggregate report and redaction</w:t>
+      </w:r>
+    </w:p>
+    <w:p>
+      <w:pPr/>
+      <w:r>
+        <w:t>-OutputJsonPath writes exactly one aggregate report for the whole run - the orchestrator is never given its own -OutputJsonPath, so no per-row report files are produced. Each row's result is redacted the same way the orchestrator redacts its own report: secrets such as a blueprint client secret are omitted unless -IncludeBlueprintSecretsInOutput is passed. Authentication inputs are never written to the report, with or without that switch.</w:t>
+      </w:r>
+    </w:p>
     <w:sectPr>
       <w:pgSz w:w="12240" w:h="15840"/>
       <w:pgMar w:top="1152" w:right="1296" w:bottom="1152" w:left="1296" w:header="720" w:footer="720" w:gutter="0"/>

</xml_diff>